<commit_message>
Methotrexate ADDIKD cutoffs + third LOESS set (% difference x-axis)
- Methotrexate dosing rule updated to ADDIKD: >=60 full / 45-59.99 -25% /
  30-44.99 -50% / <30 avoid (4 tiers; was >=100 full / 40-99 reduced / <40).
  Propagates to all methotrexate heatmap tables (e.g. CG overdose 22->10%).
- New 'LOESS (% difference)' set: x = (eGFR_Cr - eGFR_Cys)/eGFR_Cr * 100
  (CKD-EPI Cr 2021 vs Cys 2012; scale-invariant). 8 equations, 5 drugs,
  index/nonindex x over/under (32 plots). Creatinine-equation overdose rises
  with the % difference (mirror of the ratio set).

Co-Authored-By: Claude Opus 4.8 <noreply@anthropic.com>
</commit_message>
<xml_diff>
--- a/docs/tables/heatmap/mcg_cat_index_overdose.docx
+++ b/docs/tables/heatmap/mcg_cat_index_overdose.docx
@@ -3083,7 +3083,7 @@
                 <w:szCs w:val="18"/>
                 <w:color w:val="000000"/>
               </w:rPr>
-              <w:t xml:space="preserve">9.1</w:t>
+              <w:t xml:space="preserve">5.8</w:t>
             </w:r>
           </w:p>
         </w:tc>
@@ -3095,48 +3095,48 @@
               <w:left w:val="none" w:sz="0" w:space="0" w:color="000000"/>
               <w:right w:val="none" w:sz="0" w:space="0" w:color="000000"/>
             </w:tcBorders>
-            <w:shd w:val="clear" w:color="auto" w:fill="F03B20"/>
-            <w:tcMar>
-              <w:top w:w="0" w:type="dxa"/>
-              <w:bottom w:w="0" w:type="dxa"/>
-              <w:left w:w="0" w:type="dxa"/>
-              <w:right w:w="0" w:type="dxa"/>
-            </w:tcMar>
-            <w:vAlign w:val="center"/>
-          </w:tcPr>
-          <w:p>
-            <w:pPr>
-              <w:pStyle w:val="Normal"/>
-              <w:jc w:val="center"/>
-              <w:pBdr>
-                <w:bottom w:val="none" w:sz="0" w:space="0" w:color="000000"/>
-                <w:top w:val="none" w:sz="0" w:space="0" w:color="000000"/>
-                <w:left w:val="none" w:sz="0" w:space="0" w:color="000000"/>
-                <w:right w:val="none" w:sz="0" w:space="0" w:color="000000"/>
-              </w:pBdr>
-              <w:spacing w:after="100" w:before="100" w:line="240"/>
-              <w:ind w:left="100" w:right="100" w:firstLine="0" w:firstLineChars="0"/>
-              <w:rPr>
-                <w:rFonts w:ascii="Helvetica" w:hAnsi="Helvetica" w:eastAsia="Helvetica" w:cs="Helvetica"/>
-                <w:i w:val="false"/>
-                <w:b w:val="false"/>
-                <w:u w:val="none"/>
-                <w:sz w:val="18"/>
-                <w:szCs w:val="18"/>
-                <w:color w:val="FFFFFF"/>
-              </w:rPr>
-            </w:pPr>
-            <w:r>
-              <w:rPr>
-                <w:rFonts w:ascii="Helvetica" w:hAnsi="Helvetica" w:eastAsia="Helvetica" w:cs="Helvetica"/>
-                <w:i w:val="false"/>
-                <w:b w:val="false"/>
-                <w:u w:val="none"/>
-                <w:sz w:val="18"/>
-                <w:szCs w:val="18"/>
-                <w:color w:val="FFFFFF"/>
-              </w:rPr>
-              <w:t xml:space="preserve">13.4</w:t>
+            <w:shd w:val="clear" w:color="auto" w:fill="FEB24C"/>
+            <w:tcMar>
+              <w:top w:w="0" w:type="dxa"/>
+              <w:bottom w:w="0" w:type="dxa"/>
+              <w:left w:w="0" w:type="dxa"/>
+              <w:right w:w="0" w:type="dxa"/>
+            </w:tcMar>
+            <w:vAlign w:val="center"/>
+          </w:tcPr>
+          <w:p>
+            <w:pPr>
+              <w:pStyle w:val="Normal"/>
+              <w:jc w:val="center"/>
+              <w:pBdr>
+                <w:bottom w:val="none" w:sz="0" w:space="0" w:color="000000"/>
+                <w:top w:val="none" w:sz="0" w:space="0" w:color="000000"/>
+                <w:left w:val="none" w:sz="0" w:space="0" w:color="000000"/>
+                <w:right w:val="none" w:sz="0" w:space="0" w:color="000000"/>
+              </w:pBdr>
+              <w:spacing w:after="100" w:before="100" w:line="240"/>
+              <w:ind w:left="100" w:right="100" w:firstLine="0" w:firstLineChars="0"/>
+              <w:rPr>
+                <w:rFonts w:ascii="Helvetica" w:hAnsi="Helvetica" w:eastAsia="Helvetica" w:cs="Helvetica"/>
+                <w:i w:val="false"/>
+                <w:b w:val="false"/>
+                <w:u w:val="none"/>
+                <w:sz w:val="18"/>
+                <w:szCs w:val="18"/>
+                <w:color w:val="000000"/>
+              </w:rPr>
+            </w:pPr>
+            <w:r>
+              <w:rPr>
+                <w:rFonts w:ascii="Helvetica" w:hAnsi="Helvetica" w:eastAsia="Helvetica" w:cs="Helvetica"/>
+                <w:i w:val="false"/>
+                <w:b w:val="false"/>
+                <w:u w:val="none"/>
+                <w:sz w:val="18"/>
+                <w:szCs w:val="18"/>
+                <w:color w:val="000000"/>
+              </w:rPr>
+              <w:t xml:space="preserve">6.3</w:t>
             </w:r>
           </w:p>
         </w:tc>
@@ -3148,48 +3148,48 @@
               <w:left w:val="none" w:sz="0" w:space="0" w:color="000000"/>
               <w:right w:val="none" w:sz="0" w:space="0" w:color="000000"/>
             </w:tcBorders>
-            <w:shd w:val="clear" w:color="auto" w:fill="FFEDA0"/>
-            <w:tcMar>
-              <w:top w:w="0" w:type="dxa"/>
-              <w:bottom w:w="0" w:type="dxa"/>
-              <w:left w:w="0" w:type="dxa"/>
-              <w:right w:w="0" w:type="dxa"/>
-            </w:tcMar>
-            <w:vAlign w:val="center"/>
-          </w:tcPr>
-          <w:p>
-            <w:pPr>
-              <w:pStyle w:val="Normal"/>
-              <w:jc w:val="center"/>
-              <w:pBdr>
-                <w:bottom w:val="none" w:sz="0" w:space="0" w:color="000000"/>
-                <w:top w:val="none" w:sz="0" w:space="0" w:color="000000"/>
-                <w:left w:val="none" w:sz="0" w:space="0" w:color="000000"/>
-                <w:right w:val="none" w:sz="0" w:space="0" w:color="000000"/>
-              </w:pBdr>
-              <w:spacing w:after="100" w:before="100" w:line="240"/>
-              <w:ind w:left="100" w:right="100" w:firstLine="0" w:firstLineChars="0"/>
-              <w:rPr>
-                <w:rFonts w:ascii="Helvetica" w:hAnsi="Helvetica" w:eastAsia="Helvetica" w:cs="Helvetica"/>
-                <w:i w:val="false"/>
-                <w:b w:val="false"/>
-                <w:u w:val="none"/>
-                <w:sz w:val="18"/>
-                <w:szCs w:val="18"/>
-                <w:color w:val="000000"/>
-              </w:rPr>
-            </w:pPr>
-            <w:r>
-              <w:rPr>
-                <w:rFonts w:ascii="Helvetica" w:hAnsi="Helvetica" w:eastAsia="Helvetica" w:cs="Helvetica"/>
-                <w:i w:val="false"/>
-                <w:b w:val="false"/>
-                <w:u w:val="none"/>
-                <w:sz w:val="18"/>
-                <w:szCs w:val="18"/>
-                <w:color w:val="000000"/>
-              </w:rPr>
-              <w:t xml:space="preserve">4.9</w:t>
+            <w:shd w:val="clear" w:color="auto" w:fill="FEB24C"/>
+            <w:tcMar>
+              <w:top w:w="0" w:type="dxa"/>
+              <w:bottom w:w="0" w:type="dxa"/>
+              <w:left w:w="0" w:type="dxa"/>
+              <w:right w:w="0" w:type="dxa"/>
+            </w:tcMar>
+            <w:vAlign w:val="center"/>
+          </w:tcPr>
+          <w:p>
+            <w:pPr>
+              <w:pStyle w:val="Normal"/>
+              <w:jc w:val="center"/>
+              <w:pBdr>
+                <w:bottom w:val="none" w:sz="0" w:space="0" w:color="000000"/>
+                <w:top w:val="none" w:sz="0" w:space="0" w:color="000000"/>
+                <w:left w:val="none" w:sz="0" w:space="0" w:color="000000"/>
+                <w:right w:val="none" w:sz="0" w:space="0" w:color="000000"/>
+              </w:pBdr>
+              <w:spacing w:after="100" w:before="100" w:line="240"/>
+              <w:ind w:left="100" w:right="100" w:firstLine="0" w:firstLineChars="0"/>
+              <w:rPr>
+                <w:rFonts w:ascii="Helvetica" w:hAnsi="Helvetica" w:eastAsia="Helvetica" w:cs="Helvetica"/>
+                <w:i w:val="false"/>
+                <w:b w:val="false"/>
+                <w:u w:val="none"/>
+                <w:sz w:val="18"/>
+                <w:szCs w:val="18"/>
+                <w:color w:val="000000"/>
+              </w:rPr>
+            </w:pPr>
+            <w:r>
+              <w:rPr>
+                <w:rFonts w:ascii="Helvetica" w:hAnsi="Helvetica" w:eastAsia="Helvetica" w:cs="Helvetica"/>
+                <w:i w:val="false"/>
+                <w:b w:val="false"/>
+                <w:u w:val="none"/>
+                <w:sz w:val="18"/>
+                <w:szCs w:val="18"/>
+                <w:color w:val="000000"/>
+              </w:rPr>
+              <w:t xml:space="preserve">5.4</w:t>
             </w:r>
           </w:p>
         </w:tc>
@@ -3201,48 +3201,48 @@
               <w:left w:val="none" w:sz="0" w:space="0" w:color="000000"/>
               <w:right w:val="none" w:sz="0" w:space="0" w:color="000000"/>
             </w:tcBorders>
-            <w:shd w:val="clear" w:color="auto" w:fill="F03B20"/>
-            <w:tcMar>
-              <w:top w:w="0" w:type="dxa"/>
-              <w:bottom w:w="0" w:type="dxa"/>
-              <w:left w:w="0" w:type="dxa"/>
-              <w:right w:w="0" w:type="dxa"/>
-            </w:tcMar>
-            <w:vAlign w:val="center"/>
-          </w:tcPr>
-          <w:p>
-            <w:pPr>
-              <w:pStyle w:val="Normal"/>
-              <w:jc w:val="center"/>
-              <w:pBdr>
-                <w:bottom w:val="none" w:sz="0" w:space="0" w:color="000000"/>
-                <w:top w:val="none" w:sz="0" w:space="0" w:color="000000"/>
-                <w:left w:val="none" w:sz="0" w:space="0" w:color="000000"/>
-                <w:right w:val="none" w:sz="0" w:space="0" w:color="000000"/>
-              </w:pBdr>
-              <w:spacing w:after="100" w:before="100" w:line="240"/>
-              <w:ind w:left="100" w:right="100" w:firstLine="0" w:firstLineChars="0"/>
-              <w:rPr>
-                <w:rFonts w:ascii="Helvetica" w:hAnsi="Helvetica" w:eastAsia="Helvetica" w:cs="Helvetica"/>
-                <w:i w:val="false"/>
-                <w:b w:val="false"/>
-                <w:u w:val="none"/>
-                <w:sz w:val="18"/>
-                <w:szCs w:val="18"/>
-                <w:color w:val="FFFFFF"/>
-              </w:rPr>
-            </w:pPr>
-            <w:r>
-              <w:rPr>
-                <w:rFonts w:ascii="Helvetica" w:hAnsi="Helvetica" w:eastAsia="Helvetica" w:cs="Helvetica"/>
-                <w:i w:val="false"/>
-                <w:b w:val="false"/>
-                <w:u w:val="none"/>
-                <w:sz w:val="18"/>
-                <w:szCs w:val="18"/>
-                <w:color w:val="FFFFFF"/>
-              </w:rPr>
-              <w:t xml:space="preserve">13.1</w:t>
+            <w:shd w:val="clear" w:color="auto" w:fill="FFEDA0"/>
+            <w:tcMar>
+              <w:top w:w="0" w:type="dxa"/>
+              <w:bottom w:w="0" w:type="dxa"/>
+              <w:left w:w="0" w:type="dxa"/>
+              <w:right w:w="0" w:type="dxa"/>
+            </w:tcMar>
+            <w:vAlign w:val="center"/>
+          </w:tcPr>
+          <w:p>
+            <w:pPr>
+              <w:pStyle w:val="Normal"/>
+              <w:jc w:val="center"/>
+              <w:pBdr>
+                <w:bottom w:val="none" w:sz="0" w:space="0" w:color="000000"/>
+                <w:top w:val="none" w:sz="0" w:space="0" w:color="000000"/>
+                <w:left w:val="none" w:sz="0" w:space="0" w:color="000000"/>
+                <w:right w:val="none" w:sz="0" w:space="0" w:color="000000"/>
+              </w:pBdr>
+              <w:spacing w:after="100" w:before="100" w:line="240"/>
+              <w:ind w:left="100" w:right="100" w:firstLine="0" w:firstLineChars="0"/>
+              <w:rPr>
+                <w:rFonts w:ascii="Helvetica" w:hAnsi="Helvetica" w:eastAsia="Helvetica" w:cs="Helvetica"/>
+                <w:i w:val="false"/>
+                <w:b w:val="false"/>
+                <w:u w:val="none"/>
+                <w:sz w:val="18"/>
+                <w:szCs w:val="18"/>
+                <w:color w:val="000000"/>
+              </w:rPr>
+            </w:pPr>
+            <w:r>
+              <w:rPr>
+                <w:rFonts w:ascii="Helvetica" w:hAnsi="Helvetica" w:eastAsia="Helvetica" w:cs="Helvetica"/>
+                <w:i w:val="false"/>
+                <w:b w:val="false"/>
+                <w:u w:val="none"/>
+                <w:sz w:val="18"/>
+                <w:szCs w:val="18"/>
+                <w:color w:val="000000"/>
+              </w:rPr>
+              <w:t xml:space="preserve">1.6</w:t>
             </w:r>
           </w:p>
         </w:tc>
@@ -3254,48 +3254,48 @@
               <w:left w:val="none" w:sz="0" w:space="0" w:color="000000"/>
               <w:right w:val="none" w:sz="0" w:space="0" w:color="000000"/>
             </w:tcBorders>
-            <w:shd w:val="clear" w:color="auto" w:fill="F03B20"/>
-            <w:tcMar>
-              <w:top w:w="0" w:type="dxa"/>
-              <w:bottom w:w="0" w:type="dxa"/>
-              <w:left w:w="0" w:type="dxa"/>
-              <w:right w:w="0" w:type="dxa"/>
-            </w:tcMar>
-            <w:vAlign w:val="center"/>
-          </w:tcPr>
-          <w:p>
-            <w:pPr>
-              <w:pStyle w:val="Normal"/>
-              <w:jc w:val="center"/>
-              <w:pBdr>
-                <w:bottom w:val="none" w:sz="0" w:space="0" w:color="000000"/>
-                <w:top w:val="none" w:sz="0" w:space="0" w:color="000000"/>
-                <w:left w:val="none" w:sz="0" w:space="0" w:color="000000"/>
-                <w:right w:val="none" w:sz="0" w:space="0" w:color="000000"/>
-              </w:pBdr>
-              <w:spacing w:after="100" w:before="100" w:line="240"/>
-              <w:ind w:left="100" w:right="100" w:firstLine="0" w:firstLineChars="0"/>
-              <w:rPr>
-                <w:rFonts w:ascii="Helvetica" w:hAnsi="Helvetica" w:eastAsia="Helvetica" w:cs="Helvetica"/>
-                <w:i w:val="false"/>
-                <w:b w:val="false"/>
-                <w:u w:val="none"/>
-                <w:sz w:val="18"/>
-                <w:szCs w:val="18"/>
-                <w:color w:val="FFFFFF"/>
-              </w:rPr>
-            </w:pPr>
-            <w:r>
-              <w:rPr>
-                <w:rFonts w:ascii="Helvetica" w:hAnsi="Helvetica" w:eastAsia="Helvetica" w:cs="Helvetica"/>
-                <w:i w:val="false"/>
-                <w:b w:val="false"/>
-                <w:u w:val="none"/>
-                <w:sz w:val="18"/>
-                <w:szCs w:val="18"/>
-                <w:color w:val="FFFFFF"/>
-              </w:rPr>
-              <w:t xml:space="preserve">12.0</w:t>
+            <w:shd w:val="clear" w:color="auto" w:fill="FEB24C"/>
+            <w:tcMar>
+              <w:top w:w="0" w:type="dxa"/>
+              <w:bottom w:w="0" w:type="dxa"/>
+              <w:left w:w="0" w:type="dxa"/>
+              <w:right w:w="0" w:type="dxa"/>
+            </w:tcMar>
+            <w:vAlign w:val="center"/>
+          </w:tcPr>
+          <w:p>
+            <w:pPr>
+              <w:pStyle w:val="Normal"/>
+              <w:jc w:val="center"/>
+              <w:pBdr>
+                <w:bottom w:val="none" w:sz="0" w:space="0" w:color="000000"/>
+                <w:top w:val="none" w:sz="0" w:space="0" w:color="000000"/>
+                <w:left w:val="none" w:sz="0" w:space="0" w:color="000000"/>
+                <w:right w:val="none" w:sz="0" w:space="0" w:color="000000"/>
+              </w:pBdr>
+              <w:spacing w:after="100" w:before="100" w:line="240"/>
+              <w:ind w:left="100" w:right="100" w:firstLine="0" w:firstLineChars="0"/>
+              <w:rPr>
+                <w:rFonts w:ascii="Helvetica" w:hAnsi="Helvetica" w:eastAsia="Helvetica" w:cs="Helvetica"/>
+                <w:i w:val="false"/>
+                <w:b w:val="false"/>
+                <w:u w:val="none"/>
+                <w:sz w:val="18"/>
+                <w:szCs w:val="18"/>
+                <w:color w:val="000000"/>
+              </w:rPr>
+            </w:pPr>
+            <w:r>
+              <w:rPr>
+                <w:rFonts w:ascii="Helvetica" w:hAnsi="Helvetica" w:eastAsia="Helvetica" w:cs="Helvetica"/>
+                <w:i w:val="false"/>
+                <w:b w:val="false"/>
+                <w:u w:val="none"/>
+                <w:sz w:val="18"/>
+                <w:szCs w:val="18"/>
+                <w:color w:val="000000"/>
+              </w:rPr>
+              <w:t xml:space="preserve">7.3</w:t>
             </w:r>
           </w:p>
         </w:tc>
@@ -3348,7 +3348,7 @@
                 <w:szCs w:val="18"/>
                 <w:color w:val="000000"/>
               </w:rPr>
-              <w:t xml:space="preserve">8.0</w:t>
+              <w:t xml:space="preserve">6.7</w:t>
             </w:r>
           </w:p>
         </w:tc>
@@ -3360,48 +3360,48 @@
               <w:left w:val="none" w:sz="0" w:space="0" w:color="000000"/>
               <w:right w:val="none" w:sz="0" w:space="0" w:color="000000"/>
             </w:tcBorders>
-            <w:shd w:val="clear" w:color="auto" w:fill="FEB24C"/>
-            <w:tcMar>
-              <w:top w:w="0" w:type="dxa"/>
-              <w:bottom w:w="0" w:type="dxa"/>
-              <w:left w:w="0" w:type="dxa"/>
-              <w:right w:w="0" w:type="dxa"/>
-            </w:tcMar>
-            <w:vAlign w:val="center"/>
-          </w:tcPr>
-          <w:p>
-            <w:pPr>
-              <w:pStyle w:val="Normal"/>
-              <w:jc w:val="center"/>
-              <w:pBdr>
-                <w:bottom w:val="none" w:sz="0" w:space="0" w:color="000000"/>
-                <w:top w:val="none" w:sz="0" w:space="0" w:color="000000"/>
-                <w:left w:val="none" w:sz="0" w:space="0" w:color="000000"/>
-                <w:right w:val="none" w:sz="0" w:space="0" w:color="000000"/>
-              </w:pBdr>
-              <w:spacing w:after="100" w:before="100" w:line="240"/>
-              <w:ind w:left="100" w:right="100" w:firstLine="0" w:firstLineChars="0"/>
-              <w:rPr>
-                <w:rFonts w:ascii="Helvetica" w:hAnsi="Helvetica" w:eastAsia="Helvetica" w:cs="Helvetica"/>
-                <w:i w:val="false"/>
-                <w:b w:val="false"/>
-                <w:u w:val="none"/>
-                <w:sz w:val="18"/>
-                <w:szCs w:val="18"/>
-                <w:color w:val="000000"/>
-              </w:rPr>
-            </w:pPr>
-            <w:r>
-              <w:rPr>
-                <w:rFonts w:ascii="Helvetica" w:hAnsi="Helvetica" w:eastAsia="Helvetica" w:cs="Helvetica"/>
-                <w:i w:val="false"/>
-                <w:b w:val="false"/>
-                <w:u w:val="none"/>
-                <w:sz w:val="18"/>
-                <w:szCs w:val="18"/>
-                <w:color w:val="000000"/>
-              </w:rPr>
-              <w:t xml:space="preserve">7.4</w:t>
+            <w:shd w:val="clear" w:color="auto" w:fill="FFEDA0"/>
+            <w:tcMar>
+              <w:top w:w="0" w:type="dxa"/>
+              <w:bottom w:w="0" w:type="dxa"/>
+              <w:left w:w="0" w:type="dxa"/>
+              <w:right w:w="0" w:type="dxa"/>
+            </w:tcMar>
+            <w:vAlign w:val="center"/>
+          </w:tcPr>
+          <w:p>
+            <w:pPr>
+              <w:pStyle w:val="Normal"/>
+              <w:jc w:val="center"/>
+              <w:pBdr>
+                <w:bottom w:val="none" w:sz="0" w:space="0" w:color="000000"/>
+                <w:top w:val="none" w:sz="0" w:space="0" w:color="000000"/>
+                <w:left w:val="none" w:sz="0" w:space="0" w:color="000000"/>
+                <w:right w:val="none" w:sz="0" w:space="0" w:color="000000"/>
+              </w:pBdr>
+              <w:spacing w:after="100" w:before="100" w:line="240"/>
+              <w:ind w:left="100" w:right="100" w:firstLine="0" w:firstLineChars="0"/>
+              <w:rPr>
+                <w:rFonts w:ascii="Helvetica" w:hAnsi="Helvetica" w:eastAsia="Helvetica" w:cs="Helvetica"/>
+                <w:i w:val="false"/>
+                <w:b w:val="false"/>
+                <w:u w:val="none"/>
+                <w:sz w:val="18"/>
+                <w:szCs w:val="18"/>
+                <w:color w:val="000000"/>
+              </w:rPr>
+            </w:pPr>
+            <w:r>
+              <w:rPr>
+                <w:rFonts w:ascii="Helvetica" w:hAnsi="Helvetica" w:eastAsia="Helvetica" w:cs="Helvetica"/>
+                <w:i w:val="false"/>
+                <w:b w:val="false"/>
+                <w:u w:val="none"/>
+                <w:sz w:val="18"/>
+                <w:szCs w:val="18"/>
+                <w:color w:val="000000"/>
+              </w:rPr>
+              <w:t xml:space="preserve">4.1</w:t>
             </w:r>
           </w:p>
         </w:tc>
@@ -3454,7 +3454,7 @@
                 <w:szCs w:val="18"/>
                 <w:color w:val="000000"/>
               </w:rPr>
-              <w:t xml:space="preserve">9.3</w:t>
+              <w:t xml:space="preserve">5.6</w:t>
             </w:r>
           </w:p>
         </w:tc>
@@ -3507,7 +3507,7 @@
                 <w:szCs w:val="18"/>
                 <w:color w:val="000000"/>
               </w:rPr>
-              <w:t xml:space="preserve">7.9</w:t>
+              <w:t xml:space="preserve">7.3</w:t>
             </w:r>
           </w:p>
         </w:tc>
@@ -3519,48 +3519,48 @@
               <w:left w:val="none" w:sz="0" w:space="0" w:color="000000"/>
               <w:right w:val="none" w:sz="0" w:space="0" w:color="000000"/>
             </w:tcBorders>
-            <w:shd w:val="clear" w:color="auto" w:fill="F03B20"/>
-            <w:tcMar>
-              <w:top w:w="0" w:type="dxa"/>
-              <w:bottom w:w="0" w:type="dxa"/>
-              <w:left w:w="0" w:type="dxa"/>
-              <w:right w:w="0" w:type="dxa"/>
-            </w:tcMar>
-            <w:vAlign w:val="center"/>
-          </w:tcPr>
-          <w:p>
-            <w:pPr>
-              <w:pStyle w:val="Normal"/>
-              <w:jc w:val="center"/>
-              <w:pBdr>
-                <w:bottom w:val="none" w:sz="0" w:space="0" w:color="000000"/>
-                <w:top w:val="none" w:sz="0" w:space="0" w:color="000000"/>
-                <w:left w:val="none" w:sz="0" w:space="0" w:color="000000"/>
-                <w:right w:val="none" w:sz="0" w:space="0" w:color="000000"/>
-              </w:pBdr>
-              <w:spacing w:after="100" w:before="100" w:line="240"/>
-              <w:ind w:left="100" w:right="100" w:firstLine="0" w:firstLineChars="0"/>
-              <w:rPr>
-                <w:rFonts w:ascii="Helvetica" w:hAnsi="Helvetica" w:eastAsia="Helvetica" w:cs="Helvetica"/>
-                <w:i w:val="false"/>
-                <w:b w:val="false"/>
-                <w:u w:val="none"/>
-                <w:sz w:val="18"/>
-                <w:szCs w:val="18"/>
-                <w:color w:val="FFFFFF"/>
-              </w:rPr>
-            </w:pPr>
-            <w:r>
-              <w:rPr>
-                <w:rFonts w:ascii="Helvetica" w:hAnsi="Helvetica" w:eastAsia="Helvetica" w:cs="Helvetica"/>
-                <w:i w:val="false"/>
-                <w:b w:val="false"/>
-                <w:u w:val="none"/>
-                <w:sz w:val="18"/>
-                <w:szCs w:val="18"/>
-                <w:color w:val="FFFFFF"/>
-              </w:rPr>
-              <w:t xml:space="preserve">10.5</w:t>
+            <w:shd w:val="clear" w:color="auto" w:fill="FFEDA0"/>
+            <w:tcMar>
+              <w:top w:w="0" w:type="dxa"/>
+              <w:bottom w:w="0" w:type="dxa"/>
+              <w:left w:w="0" w:type="dxa"/>
+              <w:right w:w="0" w:type="dxa"/>
+            </w:tcMar>
+            <w:vAlign w:val="center"/>
+          </w:tcPr>
+          <w:p>
+            <w:pPr>
+              <w:pStyle w:val="Normal"/>
+              <w:jc w:val="center"/>
+              <w:pBdr>
+                <w:bottom w:val="none" w:sz="0" w:space="0" w:color="000000"/>
+                <w:top w:val="none" w:sz="0" w:space="0" w:color="000000"/>
+                <w:left w:val="none" w:sz="0" w:space="0" w:color="000000"/>
+                <w:right w:val="none" w:sz="0" w:space="0" w:color="000000"/>
+              </w:pBdr>
+              <w:spacing w:after="100" w:before="100" w:line="240"/>
+              <w:ind w:left="100" w:right="100" w:firstLine="0" w:firstLineChars="0"/>
+              <w:rPr>
+                <w:rFonts w:ascii="Helvetica" w:hAnsi="Helvetica" w:eastAsia="Helvetica" w:cs="Helvetica"/>
+                <w:i w:val="false"/>
+                <w:b w:val="false"/>
+                <w:u w:val="none"/>
+                <w:sz w:val="18"/>
+                <w:szCs w:val="18"/>
+                <w:color w:val="000000"/>
+              </w:rPr>
+            </w:pPr>
+            <w:r>
+              <w:rPr>
+                <w:rFonts w:ascii="Helvetica" w:hAnsi="Helvetica" w:eastAsia="Helvetica" w:cs="Helvetica"/>
+                <w:i w:val="false"/>
+                <w:b w:val="false"/>
+                <w:u w:val="none"/>
+                <w:sz w:val="18"/>
+                <w:szCs w:val="18"/>
+                <w:color w:val="000000"/>
+              </w:rPr>
+              <w:t xml:space="preserve">4.3</w:t>
             </w:r>
           </w:p>
         </w:tc>
@@ -3572,48 +3572,48 @@
               <w:left w:val="none" w:sz="0" w:space="0" w:color="000000"/>
               <w:right w:val="none" w:sz="0" w:space="0" w:color="000000"/>
             </w:tcBorders>
-            <w:shd w:val="clear" w:color="auto" w:fill="FFEDA0"/>
-            <w:tcMar>
-              <w:top w:w="0" w:type="dxa"/>
-              <w:bottom w:w="0" w:type="dxa"/>
-              <w:left w:w="0" w:type="dxa"/>
-              <w:right w:w="0" w:type="dxa"/>
-            </w:tcMar>
-            <w:vAlign w:val="center"/>
-          </w:tcPr>
-          <w:p>
-            <w:pPr>
-              <w:pStyle w:val="Normal"/>
-              <w:jc w:val="center"/>
-              <w:pBdr>
-                <w:bottom w:val="none" w:sz="0" w:space="0" w:color="000000"/>
-                <w:top w:val="none" w:sz="0" w:space="0" w:color="000000"/>
-                <w:left w:val="none" w:sz="0" w:space="0" w:color="000000"/>
-                <w:right w:val="none" w:sz="0" w:space="0" w:color="000000"/>
-              </w:pBdr>
-              <w:spacing w:after="100" w:before="100" w:line="240"/>
-              <w:ind w:left="100" w:right="100" w:firstLine="0" w:firstLineChars="0"/>
-              <w:rPr>
-                <w:rFonts w:ascii="Helvetica" w:hAnsi="Helvetica" w:eastAsia="Helvetica" w:cs="Helvetica"/>
-                <w:i w:val="false"/>
-                <w:b w:val="false"/>
-                <w:u w:val="none"/>
-                <w:sz w:val="18"/>
-                <w:szCs w:val="18"/>
-                <w:color w:val="000000"/>
-              </w:rPr>
-            </w:pPr>
-            <w:r>
-              <w:rPr>
-                <w:rFonts w:ascii="Helvetica" w:hAnsi="Helvetica" w:eastAsia="Helvetica" w:cs="Helvetica"/>
-                <w:i w:val="false"/>
-                <w:b w:val="false"/>
-                <w:u w:val="none"/>
-                <w:sz w:val="18"/>
-                <w:szCs w:val="18"/>
-                <w:color w:val="000000"/>
-              </w:rPr>
-              <w:t xml:space="preserve">3.9</w:t>
+            <w:shd w:val="clear" w:color="auto" w:fill="F03B20"/>
+            <w:tcMar>
+              <w:top w:w="0" w:type="dxa"/>
+              <w:bottom w:w="0" w:type="dxa"/>
+              <w:left w:w="0" w:type="dxa"/>
+              <w:right w:w="0" w:type="dxa"/>
+            </w:tcMar>
+            <w:vAlign w:val="center"/>
+          </w:tcPr>
+          <w:p>
+            <w:pPr>
+              <w:pStyle w:val="Normal"/>
+              <w:jc w:val="center"/>
+              <w:pBdr>
+                <w:bottom w:val="none" w:sz="0" w:space="0" w:color="000000"/>
+                <w:top w:val="none" w:sz="0" w:space="0" w:color="000000"/>
+                <w:left w:val="none" w:sz="0" w:space="0" w:color="000000"/>
+                <w:right w:val="none" w:sz="0" w:space="0" w:color="000000"/>
+              </w:pBdr>
+              <w:spacing w:after="100" w:before="100" w:line="240"/>
+              <w:ind w:left="100" w:right="100" w:firstLine="0" w:firstLineChars="0"/>
+              <w:rPr>
+                <w:rFonts w:ascii="Helvetica" w:hAnsi="Helvetica" w:eastAsia="Helvetica" w:cs="Helvetica"/>
+                <w:i w:val="false"/>
+                <w:b w:val="false"/>
+                <w:u w:val="none"/>
+                <w:sz w:val="18"/>
+                <w:szCs w:val="18"/>
+                <w:color w:val="FFFFFF"/>
+              </w:rPr>
+            </w:pPr>
+            <w:r>
+              <w:rPr>
+                <w:rFonts w:ascii="Helvetica" w:hAnsi="Helvetica" w:eastAsia="Helvetica" w:cs="Helvetica"/>
+                <w:i w:val="false"/>
+                <w:b w:val="false"/>
+                <w:u w:val="none"/>
+                <w:sz w:val="18"/>
+                <w:szCs w:val="18"/>
+                <w:color w:val="FFFFFF"/>
+              </w:rPr>
+              <w:t xml:space="preserve">11.6</w:t>
             </w:r>
           </w:p>
         </w:tc>

</xml_diff>